<commit_message>
feat: empleados, paquetes Accesos/Pro y supervisión GPS
La ficha de cliente deja de consumir cupo; Accesos y Pro se venden por separado. Incluye self-serve Pro, API de turnos, mapa/replay y PWA de campo, con migraciones unificadas en los creates base.

Co-authored-by: Cursor <cursoragent@cursor.com>
</commit_message>
<xml_diff>
--- a/docs/WM-CodeSoft-Controla-y-Control-Patrulla.docx
+++ b/docs/WM-CodeSoft-Controla-y-Control-Patrulla.docx
@@ -39,7 +39,7 @@
         <w:pStyle w:val="CoverMeta"/>
       </w:pPr>
       <w:r>
-        <w:t xml:space="preserve">Versión 1.3  ·  22 de agosto de 2026  ·  Uso interno</w:t>
+        <w:t xml:space="preserve">Versión 1.5  ·  25 de agosto de 2026  ·  Uso interno</w:t>
       </w:r>
     </w:p>
     <w:p>
@@ -1913,6 +1913,14 @@
     </w:p>
     <w:p>
       <w:pPr>
+        <w:pStyle w:val="ListBullet"/>
+      </w:pPr>
+      <w:r>
+        <w:t xml:space="preserve">En el panel empresa (/company) el sidebar es: Mi empresa (dashboard), Mis datos (perfil legal, sin pestañas) y Ajustes (pestañas Empleados | Cargos).</w:t>
+      </w:r>
+    </w:p>
+    <w:p>
+      <w:pPr>
         <w:pStyle w:val="Heading2"/>
       </w:pPr>
       <w:r>
@@ -2807,7 +2815,7 @@
         <w:pStyle w:val="Body"/>
       </w:pPr>
       <w:r>
-        <w:t xml:space="preserve">No es un solo Excel con tres hojas. Son cargas separadas, cada una un archivo de una sola hoja, o alta uno a uno. Misma base.</w:t>
+        <w:t xml:space="preserve">No es un solo Excel con tres hojas. Son cargas separadas, cada una un archivo de una sola hoja, o alta uno a uno. Misma base. La descarga Formato de empleados añade una segunda hoja Instrucciones; el import solo lee la hoja de datos (Empleados o WM).</w:t>
       </w:r>
     </w:p>
     <w:tbl>
@@ -3018,7 +3026,7 @@
         <w:pStyle w:val="Body"/>
       </w:pPr>
       <w:r>
-        <w:t xml:space="preserve">Descarga de empleados: mismas columnas (sin fantasía), edad calculada y asignación si la tiene. Descarga de clientes e instalaciones: fichas propias.</w:t>
+        <w:t xml:space="preserve">Descarga Formato: plantilla vacía con las 26 columnas del maestro WM más hoja Instrucciones. Carga masiva: revisar filas y aceptar; no se guarda hasta aceptar. Email Ficha es obligatorio en sistema aunque vaya gris. I–L (razón social, instalaciones, sector, puesto) todo-o-nada; si el árbol aún no existe, deben ir vacías. Cargo inexistente se crea en el catálogo. No archiva ni crea usuario.</w:t>
       </w:r>
     </w:p>
     <w:p>
@@ -3915,7 +3923,7 @@
         <w:pStyle w:val="FooterNote"/>
       </w:pPr>
       <w:r>
-        <w:t xml:space="preserve">Versión 1.3. Sustituye la 1.2. Documento interno.</w:t>
+        <w:t xml:space="preserve">Versión 1.5. Sustituye la 1.4. Documento interno.</w:t>
       </w:r>
     </w:p>
     <w:sectPr>

</xml_diff>